<commit_message>
checkpoint: completed Phase 16 Kanban & BOM, ready for Phase 17 Sales Order driven MTO architecture
</commit_message>
<xml_diff>
--- a/Supthavee_ERP_Document_Standards.docx
+++ b/Supthavee_ERP_Document_Standards.docx
@@ -211,6 +211,11 @@
           <w:right w:val="nil"/>
           <w:between w:val="nil"/>
         </w:pBdr>
+        <w:rPr>
+          <w:rFonts w:ascii="Arial Unicode MS" w:eastAsia="Arial Unicode MS" w:hAnsi="Arial Unicode MS" w:cs="Arial Unicode MS"/>
+          <w:b/>
+          <w:bCs/>
+        </w:rPr>
       </w:pPr>
       <w:r>
         <w:rPr>
@@ -220,132 +225,86 @@
         </w:rPr>
         <w:t xml:space="preserve">SO (Sales Order - </w:t>
       </w:r>
-      <w:proofErr w:type="spellStart"/>
-      <w:r>
-        <w:rPr>
-          <w:rFonts w:ascii="Arial Unicode MS" w:eastAsia="Arial Unicode MS" w:hAnsi="Arial Unicode MS" w:cs="Arial Unicode MS"/>
-          <w:b/>
-          <w:bCs/>
+      <w:r>
+        <w:rPr>
+          <w:rFonts w:ascii="Arial Unicode MS" w:eastAsia="Arial Unicode MS" w:hAnsi="Arial Unicode MS" w:cs="Arial Unicode MS" w:hint="cs"/>
+          <w:b/>
+          <w:bCs/>
+          <w:cs/>
         </w:rPr>
         <w:t>ใบสั่งขาย</w:t>
       </w:r>
-      <w:proofErr w:type="spellEnd"/>
-      <w:r>
-        <w:rPr>
-          <w:rFonts w:ascii="Arial Unicode MS" w:eastAsia="Arial Unicode MS" w:hAnsi="Arial Unicode MS" w:cs="Arial Unicode MS"/>
-          <w:b/>
-          <w:bCs/>
-        </w:rPr>
-        <w:t>):</w:t>
-      </w:r>
-      <w:r>
-        <w:rPr>
-          <w:rFonts w:ascii="Arial Unicode MS" w:eastAsia="Arial Unicode MS" w:hAnsi="Arial Unicode MS" w:cs="Arial Unicode MS"/>
-        </w:rPr>
-        <w:t xml:space="preserve"> </w:t>
-      </w:r>
-      <w:proofErr w:type="spellStart"/>
-      <w:r>
-        <w:rPr>
-          <w:rFonts w:ascii="Arial Unicode MS" w:eastAsia="Arial Unicode MS" w:hAnsi="Arial Unicode MS" w:cs="Arial Unicode MS"/>
+      <w:r>
+        <w:rPr>
+          <w:rFonts w:ascii="Arial Unicode MS" w:eastAsia="Arial Unicode MS" w:hAnsi="Arial Unicode MS" w:cs="Arial Unicode MS"/>
+          <w:b/>
+          <w:bCs/>
+          <w:cs/>
+        </w:rPr>
+        <w:t xml:space="preserve">): </w:t>
+      </w:r>
+      <w:r>
+        <w:rPr>
+          <w:rFonts w:ascii="Arial Unicode MS" w:eastAsia="Arial Unicode MS" w:hAnsi="Arial Unicode MS" w:cs="Arial Unicode MS" w:hint="cs"/>
+          <w:b/>
+          <w:bCs/>
+          <w:cs/>
         </w:rPr>
         <w:t>ยืนยันคำสั่งซื้อ</w:t>
       </w:r>
-      <w:proofErr w:type="spellEnd"/>
-      <w:r>
-        <w:rPr>
-          <w:rFonts w:ascii="Arial Unicode MS" w:eastAsia="Arial Unicode MS" w:hAnsi="Arial Unicode MS" w:cs="Arial Unicode MS"/>
-        </w:rPr>
-        <w:t xml:space="preserve"> </w:t>
-      </w:r>
-      <w:proofErr w:type="spellStart"/>
-      <w:r>
-        <w:rPr>
-          <w:rFonts w:ascii="Arial Unicode MS" w:eastAsia="Arial Unicode MS" w:hAnsi="Arial Unicode MS" w:cs="Arial Unicode MS"/>
+      <w:r>
+        <w:rPr>
+          <w:rFonts w:ascii="Arial Unicode MS" w:eastAsia="Arial Unicode MS" w:hAnsi="Arial Unicode MS" w:cs="Arial Unicode MS"/>
+          <w:b/>
+          <w:bCs/>
+          <w:cs/>
+        </w:rPr>
+        <w:t xml:space="preserve"> </w:t>
+      </w:r>
+      <w:r>
+        <w:rPr>
+          <w:rFonts w:ascii="Arial Unicode MS" w:eastAsia="Arial Unicode MS" w:hAnsi="Arial Unicode MS" w:cs="Arial Unicode MS" w:hint="cs"/>
+          <w:b/>
+          <w:bCs/>
+          <w:cs/>
         </w:rPr>
         <w:t>ทำหน้าที่</w:t>
       </w:r>
-      <w:proofErr w:type="spellEnd"/>
-      <w:r>
-        <w:rPr>
-          <w:rFonts w:ascii="Arial Unicode MS" w:eastAsia="Arial Unicode MS" w:hAnsi="Arial Unicode MS" w:cs="Arial Unicode MS"/>
-        </w:rPr>
-        <w:t xml:space="preserve"> </w:t>
-      </w:r>
-      <w:proofErr w:type="spellStart"/>
-      <w:r>
-        <w:rPr>
-          <w:rFonts w:ascii="Arial Unicode MS" w:eastAsia="Arial Unicode MS" w:hAnsi="Arial Unicode MS" w:cs="Arial Unicode MS"/>
-          <w:b/>
-          <w:bCs/>
+      <w:r>
+        <w:rPr>
+          <w:rFonts w:ascii="Arial Unicode MS" w:eastAsia="Arial Unicode MS" w:hAnsi="Arial Unicode MS" w:cs="Arial Unicode MS"/>
+          <w:b/>
+          <w:bCs/>
+          <w:cs/>
+        </w:rPr>
+        <w:t xml:space="preserve"> </w:t>
+      </w:r>
+      <w:r>
+        <w:rPr>
+          <w:rFonts w:ascii="Arial Unicode MS" w:eastAsia="Arial Unicode MS" w:hAnsi="Arial Unicode MS" w:cs="Arial Unicode MS" w:hint="cs"/>
+          <w:b/>
+          <w:bCs/>
+          <w:cs/>
         </w:rPr>
         <w:t>จองสต็อก</w:t>
       </w:r>
-      <w:proofErr w:type="spellEnd"/>
-      <w:r>
-        <w:rPr>
-          <w:rFonts w:ascii="Arial Unicode MS" w:eastAsia="Arial Unicode MS" w:hAnsi="Arial Unicode MS" w:cs="Arial Unicode MS"/>
-          <w:b/>
-          <w:bCs/>
-        </w:rPr>
-        <w:t xml:space="preserve"> (Soft Allocation/ATP)</w:t>
-      </w:r>
-      <w:r>
-        <w:rPr>
-          <w:rFonts w:ascii="Arial Unicode MS" w:eastAsia="Arial Unicode MS" w:hAnsi="Arial Unicode MS" w:cs="Arial Unicode MS"/>
-        </w:rPr>
-        <w:t xml:space="preserve"> </w:t>
-      </w:r>
-      <w:proofErr w:type="spellStart"/>
-      <w:r>
-        <w:rPr>
-          <w:rFonts w:ascii="Arial Unicode MS" w:eastAsia="Arial Unicode MS" w:hAnsi="Arial Unicode MS" w:cs="Arial Unicode MS"/>
-        </w:rPr>
-        <w:t>หากเป็นงานบริการ</w:t>
-      </w:r>
-      <w:proofErr w:type="spellEnd"/>
-      <w:r>
-        <w:rPr>
-          <w:rFonts w:ascii="Arial Unicode MS" w:eastAsia="Arial Unicode MS" w:hAnsi="Arial Unicode MS" w:cs="Arial Unicode MS"/>
-        </w:rPr>
-        <w:t xml:space="preserve"> (MTO) </w:t>
-      </w:r>
-      <w:proofErr w:type="spellStart"/>
-      <w:r>
-        <w:rPr>
-          <w:rFonts w:ascii="Arial Unicode MS" w:eastAsia="Arial Unicode MS" w:hAnsi="Arial Unicode MS" w:cs="Arial Unicode MS"/>
-        </w:rPr>
-        <w:t>สามารถกดยืนยันเพื่อ</w:t>
-      </w:r>
-      <w:proofErr w:type="spellEnd"/>
-      <w:r>
-        <w:rPr>
-          <w:rFonts w:ascii="Arial Unicode MS" w:eastAsia="Arial Unicode MS" w:hAnsi="Arial Unicode MS" w:cs="Arial Unicode MS"/>
-        </w:rPr>
-        <w:t xml:space="preserve"> "</w:t>
-      </w:r>
-      <w:proofErr w:type="spellStart"/>
-      <w:r>
-        <w:rPr>
-          <w:rFonts w:ascii="Arial Unicode MS" w:eastAsia="Arial Unicode MS" w:hAnsi="Arial Unicode MS" w:cs="Arial Unicode MS"/>
-        </w:rPr>
-        <w:t>ส่งงานผลิต</w:t>
-      </w:r>
-      <w:proofErr w:type="spellEnd"/>
-      <w:r>
-        <w:rPr>
-          <w:rFonts w:ascii="Arial Unicode MS" w:eastAsia="Arial Unicode MS" w:hAnsi="Arial Unicode MS" w:cs="Arial Unicode MS"/>
-        </w:rPr>
-        <w:t xml:space="preserve">" </w:t>
-      </w:r>
-      <w:proofErr w:type="spellStart"/>
-      <w:r>
-        <w:rPr>
-          <w:rFonts w:ascii="Arial Unicode MS" w:eastAsia="Arial Unicode MS" w:hAnsi="Arial Unicode MS" w:cs="Arial Unicode MS"/>
-        </w:rPr>
-        <w:t>ได้</w:t>
-      </w:r>
-      <w:proofErr w:type="spellEnd"/>
+      <w:r>
+        <w:rPr>
+          <w:rFonts w:ascii="Arial Unicode MS" w:eastAsia="Arial Unicode MS" w:hAnsi="Arial Unicode MS" w:cs="Arial Unicode MS"/>
+          <w:b/>
+          <w:bCs/>
+          <w:cs/>
+        </w:rPr>
+        <w:t xml:space="preserve"> (</w:t>
+      </w:r>
+      <w:r>
+        <w:rPr>
+          <w:rFonts w:ascii="Arial Unicode MS" w:eastAsia="Arial Unicode MS" w:hAnsi="Arial Unicode MS" w:cs="Arial Unicode MS"/>
+          <w:b/>
+          <w:bCs/>
+        </w:rPr>
+        <w:t xml:space="preserve">Soft Allocation/ATP) </w:t>
+      </w:r>
     </w:p>
     <w:p>
       <w:pPr>
@@ -367,86 +326,226 @@
           <w:b/>
           <w:bCs/>
         </w:rPr>
-        <w:t xml:space="preserve">INV_DO (Invoice/Delivery Order - </w:t>
-      </w:r>
-      <w:proofErr w:type="spellStart"/>
-      <w:r>
-        <w:rPr>
-          <w:rFonts w:ascii="Arial Unicode MS" w:eastAsia="Arial Unicode MS" w:hAnsi="Arial Unicode MS" w:cs="Arial Unicode MS"/>
-          <w:b/>
-          <w:bCs/>
-        </w:rPr>
-        <w:t>ใบกำกับสินค้า</w:t>
-      </w:r>
-      <w:proofErr w:type="spellEnd"/>
-      <w:r>
-        <w:rPr>
-          <w:rFonts w:ascii="Arial Unicode MS" w:eastAsia="Arial Unicode MS" w:hAnsi="Arial Unicode MS" w:cs="Arial Unicode MS"/>
-          <w:b/>
-          <w:bCs/>
+        <w:t>*</w:t>
+      </w:r>
+      <w:r>
+        <w:rPr>
+          <w:rFonts w:ascii="Arial Unicode MS" w:eastAsia="Arial Unicode MS" w:hAnsi="Arial Unicode MS" w:cs="Arial Unicode MS" w:hint="cs"/>
+          <w:b/>
+          <w:bCs/>
+          <w:cs/>
+        </w:rPr>
+        <w:t>พิเศษสำหรับระบบงานสั่งผลิต</w:t>
+      </w:r>
+      <w:r>
+        <w:rPr>
+          <w:rFonts w:ascii="Arial Unicode MS" w:eastAsia="Arial Unicode MS" w:hAnsi="Arial Unicode MS" w:cs="Arial Unicode MS"/>
+          <w:b/>
+          <w:bCs/>
+          <w:cs/>
+        </w:rPr>
+        <w:t xml:space="preserve"> (</w:t>
+      </w:r>
+      <w:r>
+        <w:rPr>
+          <w:rFonts w:ascii="Arial Unicode MS" w:eastAsia="Arial Unicode MS" w:hAnsi="Arial Unicode MS" w:cs="Arial Unicode MS"/>
+          <w:b/>
+          <w:bCs/>
+        </w:rPr>
+        <w:t xml:space="preserve">In-house Production): SO </w:t>
+      </w:r>
+      <w:r>
+        <w:rPr>
+          <w:rFonts w:ascii="Arial Unicode MS" w:eastAsia="Arial Unicode MS" w:hAnsi="Arial Unicode MS" w:cs="Arial Unicode MS" w:hint="cs"/>
+          <w:b/>
+          <w:bCs/>
+          <w:cs/>
+        </w:rPr>
+        <w:t>จะทำหน้าที่เป็นเอกสารต้นทางที่</w:t>
+      </w:r>
+      <w:r>
+        <w:rPr>
+          <w:rFonts w:ascii="Arial Unicode MS" w:eastAsia="Arial Unicode MS" w:hAnsi="Arial Unicode MS" w:cs="Arial Unicode MS"/>
+          <w:b/>
+          <w:bCs/>
+          <w:cs/>
+        </w:rPr>
+        <w:t xml:space="preserve"> </w:t>
+      </w:r>
+      <w:r>
+        <w:rPr>
+          <w:rFonts w:ascii="Arial Unicode MS" w:eastAsia="Arial Unicode MS" w:hAnsi="Arial Unicode MS" w:cs="Arial Unicode MS"/>
+          <w:b/>
+          <w:bCs/>
+        </w:rPr>
+        <w:t xml:space="preserve">Sales </w:t>
+      </w:r>
+      <w:r>
+        <w:rPr>
+          <w:rFonts w:ascii="Arial Unicode MS" w:eastAsia="Arial Unicode MS" w:hAnsi="Arial Unicode MS" w:cs="Arial Unicode MS" w:hint="cs"/>
+          <w:b/>
+          <w:bCs/>
+          <w:cs/>
+        </w:rPr>
+        <w:t>ระบุรายละเอียดไซส์</w:t>
+      </w:r>
+      <w:r>
+        <w:rPr>
+          <w:rFonts w:ascii="Arial Unicode MS" w:eastAsia="Arial Unicode MS" w:hAnsi="Arial Unicode MS" w:cs="Arial Unicode MS"/>
+          <w:b/>
+          <w:bCs/>
+          <w:cs/>
         </w:rPr>
         <w:t>/</w:t>
       </w:r>
-      <w:proofErr w:type="spellStart"/>
-      <w:r>
-        <w:rPr>
-          <w:rFonts w:ascii="Arial Unicode MS" w:eastAsia="Arial Unicode MS" w:hAnsi="Arial Unicode MS" w:cs="Arial Unicode MS"/>
-          <w:b/>
-          <w:bCs/>
-        </w:rPr>
-        <w:t>ใบส่งของ</w:t>
-      </w:r>
-      <w:proofErr w:type="spellEnd"/>
-      <w:r>
-        <w:rPr>
-          <w:rFonts w:ascii="Arial Unicode MS" w:eastAsia="Arial Unicode MS" w:hAnsi="Arial Unicode MS" w:cs="Arial Unicode MS"/>
-          <w:b/>
-          <w:bCs/>
-        </w:rPr>
-        <w:t>):</w:t>
-      </w:r>
-      <w:r>
-        <w:rPr>
-          <w:rFonts w:ascii="Arial Unicode MS" w:eastAsia="Arial Unicode MS" w:hAnsi="Arial Unicode MS" w:cs="Arial Unicode MS"/>
-        </w:rPr>
-        <w:t xml:space="preserve"> </w:t>
-      </w:r>
-      <w:proofErr w:type="spellStart"/>
-      <w:r>
-        <w:rPr>
-          <w:rFonts w:ascii="Arial Unicode MS" w:eastAsia="Arial Unicode MS" w:hAnsi="Arial Unicode MS" w:cs="Arial Unicode MS"/>
-        </w:rPr>
-        <w:t>บิลขายทั่วไป</w:t>
-      </w:r>
-      <w:proofErr w:type="spellEnd"/>
-      <w:r>
-        <w:rPr>
-          <w:rFonts w:ascii="Arial Unicode MS" w:eastAsia="Arial Unicode MS" w:hAnsi="Arial Unicode MS" w:cs="Arial Unicode MS"/>
+      <w:r>
+        <w:rPr>
+          <w:rFonts w:ascii="Arial Unicode MS" w:eastAsia="Arial Unicode MS" w:hAnsi="Arial Unicode MS" w:cs="Arial Unicode MS"/>
+          <w:b/>
+          <w:bCs/>
+        </w:rPr>
+        <w:t xml:space="preserve">SKU </w:t>
+      </w:r>
+      <w:r>
+        <w:rPr>
+          <w:rFonts w:ascii="Arial Unicode MS" w:eastAsia="Arial Unicode MS" w:hAnsi="Arial Unicode MS" w:cs="Arial Unicode MS" w:hint="cs"/>
+          <w:b/>
+          <w:bCs/>
+          <w:cs/>
+        </w:rPr>
+        <w:t>และแนบรูปภาพ</w:t>
+      </w:r>
+      <w:r>
+        <w:rPr>
+          <w:rFonts w:ascii="Arial Unicode MS" w:eastAsia="Arial Unicode MS" w:hAnsi="Arial Unicode MS" w:cs="Arial Unicode MS"/>
+          <w:b/>
+          <w:bCs/>
+          <w:cs/>
+        </w:rPr>
+        <w:t xml:space="preserve"> </w:t>
+      </w:r>
+      <w:r>
+        <w:rPr>
+          <w:rFonts w:ascii="Arial Unicode MS" w:eastAsia="Arial Unicode MS" w:hAnsi="Arial Unicode MS" w:cs="Arial Unicode MS"/>
+          <w:b/>
+          <w:bCs/>
+        </w:rPr>
+        <w:t xml:space="preserve">Mockup </w:t>
+      </w:r>
+      <w:r>
+        <w:rPr>
+          <w:rFonts w:ascii="Arial Unicode MS" w:eastAsia="Arial Unicode MS" w:hAnsi="Arial Unicode MS" w:cs="Arial Unicode MS" w:hint="cs"/>
+          <w:b/>
+          <w:bCs/>
+          <w:cs/>
+        </w:rPr>
+        <w:t>เมื่อกดยืนยัน</w:t>
+      </w:r>
+      <w:r>
+        <w:rPr>
+          <w:rFonts w:ascii="Arial Unicode MS" w:eastAsia="Arial Unicode MS" w:hAnsi="Arial Unicode MS" w:cs="Arial Unicode MS"/>
+          <w:b/>
+          <w:bCs/>
+          <w:cs/>
+        </w:rPr>
+        <w:t xml:space="preserve"> "</w:t>
+      </w:r>
+      <w:r>
+        <w:rPr>
+          <w:rFonts w:ascii="Arial Unicode MS" w:eastAsia="Arial Unicode MS" w:hAnsi="Arial Unicode MS" w:cs="Arial Unicode MS" w:hint="cs"/>
+          <w:b/>
+          <w:bCs/>
+          <w:cs/>
+        </w:rPr>
+        <w:t>ส่งงานผลิต</w:t>
+      </w:r>
+      <w:r>
+        <w:rPr>
+          <w:rFonts w:ascii="Arial Unicode MS" w:eastAsia="Arial Unicode MS" w:hAnsi="Arial Unicode MS" w:cs="Arial Unicode MS"/>
+          <w:b/>
+          <w:bCs/>
+          <w:cs/>
+        </w:rPr>
+        <w:t xml:space="preserve">" </w:t>
+      </w:r>
+      <w:r>
+        <w:rPr>
+          <w:rFonts w:ascii="Arial Unicode MS" w:eastAsia="Arial Unicode MS" w:hAnsi="Arial Unicode MS" w:cs="Arial Unicode MS" w:hint="cs"/>
+          <w:b/>
+          <w:bCs/>
+          <w:cs/>
+        </w:rPr>
+        <w:t>ระบบจะทำการสร้างใบสั่งผลิต</w:t>
+      </w:r>
+      <w:r>
+        <w:rPr>
+          <w:rFonts w:ascii="Arial Unicode MS" w:eastAsia="Arial Unicode MS" w:hAnsi="Arial Unicode MS" w:cs="Arial Unicode MS"/>
+          <w:b/>
+          <w:bCs/>
+          <w:cs/>
         </w:rPr>
         <w:t xml:space="preserve"> (</w:t>
       </w:r>
-      <w:proofErr w:type="spellStart"/>
-      <w:r>
-        <w:rPr>
-          <w:rFonts w:ascii="Arial Unicode MS" w:eastAsia="Arial Unicode MS" w:hAnsi="Arial Unicode MS" w:cs="Arial Unicode MS"/>
-        </w:rPr>
-        <w:t>ไม่มี</w:t>
-      </w:r>
-      <w:proofErr w:type="spellEnd"/>
-      <w:r>
-        <w:rPr>
-          <w:rFonts w:ascii="Arial Unicode MS" w:eastAsia="Arial Unicode MS" w:hAnsi="Arial Unicode MS" w:cs="Arial Unicode MS"/>
-        </w:rPr>
-        <w:t xml:space="preserve"> VAT) </w:t>
-      </w:r>
-      <w:proofErr w:type="spellStart"/>
-      <w:r>
-        <w:rPr>
-          <w:rFonts w:ascii="Arial Unicode MS" w:eastAsia="Arial Unicode MS" w:hAnsi="Arial Unicode MS" w:cs="Arial Unicode MS"/>
-        </w:rPr>
-        <w:t>มีผลตัดสต็อกขาออกทันที</w:t>
-      </w:r>
-      <w:proofErr w:type="spellEnd"/>
+      <w:r>
+        <w:rPr>
+          <w:rFonts w:ascii="Arial Unicode MS" w:eastAsia="Arial Unicode MS" w:hAnsi="Arial Unicode MS" w:cs="Arial Unicode MS"/>
+          <w:b/>
+          <w:bCs/>
+        </w:rPr>
+        <w:t xml:space="preserve">MTO) </w:t>
+      </w:r>
+      <w:r>
+        <w:rPr>
+          <w:rFonts w:ascii="Arial Unicode MS" w:eastAsia="Arial Unicode MS" w:hAnsi="Arial Unicode MS" w:cs="Arial Unicode MS" w:hint="cs"/>
+          <w:b/>
+          <w:bCs/>
+          <w:cs/>
+        </w:rPr>
+        <w:t>บน</w:t>
+      </w:r>
+      <w:r>
+        <w:rPr>
+          <w:rFonts w:ascii="Arial Unicode MS" w:eastAsia="Arial Unicode MS" w:hAnsi="Arial Unicode MS" w:cs="Arial Unicode MS"/>
+          <w:b/>
+          <w:bCs/>
+          <w:cs/>
+        </w:rPr>
+        <w:t xml:space="preserve"> </w:t>
+      </w:r>
+      <w:r>
+        <w:rPr>
+          <w:rFonts w:ascii="Arial Unicode MS" w:eastAsia="Arial Unicode MS" w:hAnsi="Arial Unicode MS" w:cs="Arial Unicode MS"/>
+          <w:b/>
+          <w:bCs/>
+        </w:rPr>
+        <w:t xml:space="preserve">Kanban Board </w:t>
+      </w:r>
+      <w:r>
+        <w:rPr>
+          <w:rFonts w:ascii="Arial Unicode MS" w:eastAsia="Arial Unicode MS" w:hAnsi="Arial Unicode MS" w:cs="Arial Unicode MS" w:hint="cs"/>
+          <w:b/>
+          <w:bCs/>
+          <w:cs/>
+        </w:rPr>
+        <w:t>พร้อมคำนวณวัตถุดิบอัตโนมัติ</w:t>
+      </w:r>
+      <w:r>
+        <w:rPr>
+          <w:rFonts w:ascii="Arial Unicode MS" w:eastAsia="Arial Unicode MS" w:hAnsi="Arial Unicode MS" w:cs="Arial Unicode MS"/>
+          <w:b/>
+          <w:bCs/>
+          <w:cs/>
+        </w:rPr>
+        <w:t xml:space="preserve"> (</w:t>
+      </w:r>
+      <w:r>
+        <w:rPr>
+          <w:rFonts w:ascii="Arial Unicode MS" w:eastAsia="Arial Unicode MS" w:hAnsi="Arial Unicode MS" w:cs="Arial Unicode MS"/>
+          <w:b/>
+          <w:bCs/>
+        </w:rPr>
+        <w:t>Sales Order Driven Production)</w:t>
+      </w:r>
     </w:p>
     <w:p>
       <w:pPr>
@@ -468,16 +567,34 @@
           <w:b/>
           <w:bCs/>
         </w:rPr>
-        <w:t xml:space="preserve">TAX_INV (Tax Invoice - </w:t>
-      </w:r>
-      <w:proofErr w:type="spellStart"/>
-      <w:r>
-        <w:rPr>
-          <w:rFonts w:ascii="Arial Unicode MS" w:eastAsia="Arial Unicode MS" w:hAnsi="Arial Unicode MS" w:cs="Arial Unicode MS"/>
-          <w:b/>
-          <w:bCs/>
-        </w:rPr>
-        <w:t>ใบกำกับภาษีเต็มรูป</w:t>
+        <w:t xml:space="preserve">INV_DO (Invoice/Delivery Order - </w:t>
+      </w:r>
+      <w:proofErr w:type="spellStart"/>
+      <w:r>
+        <w:rPr>
+          <w:rFonts w:ascii="Arial Unicode MS" w:eastAsia="Arial Unicode MS" w:hAnsi="Arial Unicode MS" w:cs="Arial Unicode MS"/>
+          <w:b/>
+          <w:bCs/>
+        </w:rPr>
+        <w:t>ใบกำกับสินค้า</w:t>
+      </w:r>
+      <w:proofErr w:type="spellEnd"/>
+      <w:r>
+        <w:rPr>
+          <w:rFonts w:ascii="Arial Unicode MS" w:eastAsia="Arial Unicode MS" w:hAnsi="Arial Unicode MS" w:cs="Arial Unicode MS"/>
+          <w:b/>
+          <w:bCs/>
+        </w:rPr>
+        <w:t>/</w:t>
+      </w:r>
+      <w:proofErr w:type="spellStart"/>
+      <w:r>
+        <w:rPr>
+          <w:rFonts w:ascii="Arial Unicode MS" w:eastAsia="Arial Unicode MS" w:hAnsi="Arial Unicode MS" w:cs="Arial Unicode MS"/>
+          <w:b/>
+          <w:bCs/>
+        </w:rPr>
+        <w:t>ใบส่งของ</w:t>
       </w:r>
       <w:proofErr w:type="spellEnd"/>
       <w:r>
@@ -499,35 +616,35 @@
         <w:rPr>
           <w:rFonts w:ascii="Arial Unicode MS" w:eastAsia="Arial Unicode MS" w:hAnsi="Arial Unicode MS" w:cs="Arial Unicode MS"/>
         </w:rPr>
-        <w:t>บิลขายสำหรับบริษัทที่จดทะเบียน</w:t>
-      </w:r>
-      <w:proofErr w:type="spellEnd"/>
-      <w:r>
-        <w:rPr>
-          <w:rFonts w:ascii="Arial Unicode MS" w:eastAsia="Arial Unicode MS" w:hAnsi="Arial Unicode MS" w:cs="Arial Unicode MS"/>
-        </w:rPr>
-        <w:t xml:space="preserve"> VAT (</w:t>
-      </w:r>
-      <w:proofErr w:type="spellStart"/>
-      <w:r>
-        <w:rPr>
-          <w:rFonts w:ascii="Arial Unicode MS" w:eastAsia="Arial Unicode MS" w:hAnsi="Arial Unicode MS" w:cs="Arial Unicode MS"/>
-        </w:rPr>
-        <w:t>คำนวณภาษีแบบ</w:t>
-      </w:r>
-      <w:proofErr w:type="spellEnd"/>
-      <w:r>
-        <w:rPr>
-          <w:rFonts w:ascii="Arial Unicode MS" w:eastAsia="Arial Unicode MS" w:hAnsi="Arial Unicode MS" w:cs="Arial Unicode MS"/>
-        </w:rPr>
-        <w:t xml:space="preserve"> Exclusive/Inclusive) </w:t>
-      </w:r>
-      <w:proofErr w:type="spellStart"/>
-      <w:r>
-        <w:rPr>
-          <w:rFonts w:ascii="Arial Unicode MS" w:eastAsia="Arial Unicode MS" w:hAnsi="Arial Unicode MS" w:cs="Arial Unicode MS"/>
-        </w:rPr>
-        <w:t>มีผลตัดสต็อกขาออก</w:t>
+        <w:t>บิลขายทั่วไป</w:t>
+      </w:r>
+      <w:proofErr w:type="spellEnd"/>
+      <w:r>
+        <w:rPr>
+          <w:rFonts w:ascii="Arial Unicode MS" w:eastAsia="Arial Unicode MS" w:hAnsi="Arial Unicode MS" w:cs="Arial Unicode MS"/>
+        </w:rPr>
+        <w:t xml:space="preserve"> (</w:t>
+      </w:r>
+      <w:proofErr w:type="spellStart"/>
+      <w:r>
+        <w:rPr>
+          <w:rFonts w:ascii="Arial Unicode MS" w:eastAsia="Arial Unicode MS" w:hAnsi="Arial Unicode MS" w:cs="Arial Unicode MS"/>
+        </w:rPr>
+        <w:t>ไม่มี</w:t>
+      </w:r>
+      <w:proofErr w:type="spellEnd"/>
+      <w:r>
+        <w:rPr>
+          <w:rFonts w:ascii="Arial Unicode MS" w:eastAsia="Arial Unicode MS" w:hAnsi="Arial Unicode MS" w:cs="Arial Unicode MS"/>
+        </w:rPr>
+        <w:t xml:space="preserve"> VAT) </w:t>
+      </w:r>
+      <w:proofErr w:type="spellStart"/>
+      <w:r>
+        <w:rPr>
+          <w:rFonts w:ascii="Arial Unicode MS" w:eastAsia="Arial Unicode MS" w:hAnsi="Arial Unicode MS" w:cs="Arial Unicode MS"/>
+        </w:rPr>
+        <w:t>มีผลตัดสต็อกขาออกทันที</w:t>
       </w:r>
       <w:proofErr w:type="spellEnd"/>
     </w:p>
@@ -551,16 +668,16 @@
           <w:b/>
           <w:bCs/>
         </w:rPr>
-        <w:t xml:space="preserve">CS_TAX (Cash Sale Tax - </w:t>
-      </w:r>
-      <w:proofErr w:type="spellStart"/>
-      <w:r>
-        <w:rPr>
-          <w:rFonts w:ascii="Arial Unicode MS" w:eastAsia="Arial Unicode MS" w:hAnsi="Arial Unicode MS" w:cs="Arial Unicode MS"/>
-          <w:b/>
-          <w:bCs/>
-        </w:rPr>
-        <w:t>ใบกำกับภาษีอย่างย่อ</w:t>
+        <w:t xml:space="preserve">TAX_INV (Tax Invoice - </w:t>
+      </w:r>
+      <w:proofErr w:type="spellStart"/>
+      <w:r>
+        <w:rPr>
+          <w:rFonts w:ascii="Arial Unicode MS" w:eastAsia="Arial Unicode MS" w:hAnsi="Arial Unicode MS" w:cs="Arial Unicode MS"/>
+          <w:b/>
+          <w:bCs/>
+        </w:rPr>
+        <w:t>ใบกำกับภาษีเต็มรูป</w:t>
       </w:r>
       <w:proofErr w:type="spellEnd"/>
       <w:r>
@@ -582,28 +699,28 @@
         <w:rPr>
           <w:rFonts w:ascii="Arial Unicode MS" w:eastAsia="Arial Unicode MS" w:hAnsi="Arial Unicode MS" w:cs="Arial Unicode MS"/>
         </w:rPr>
-        <w:t>บิลขายหน้าร้าน</w:t>
-      </w:r>
-      <w:proofErr w:type="spellEnd"/>
-      <w:r>
-        <w:rPr>
-          <w:rFonts w:ascii="Arial Unicode MS" w:eastAsia="Arial Unicode MS" w:hAnsi="Arial Unicode MS" w:cs="Arial Unicode MS"/>
-        </w:rPr>
-        <w:t xml:space="preserve"> (ABB) </w:t>
-      </w:r>
-      <w:proofErr w:type="spellStart"/>
-      <w:r>
-        <w:rPr>
-          <w:rFonts w:ascii="Arial Unicode MS" w:eastAsia="Arial Unicode MS" w:hAnsi="Arial Unicode MS" w:cs="Arial Unicode MS"/>
-        </w:rPr>
-        <w:t>สำหรับลูกค้าทั่วไป</w:t>
-      </w:r>
-      <w:proofErr w:type="spellEnd"/>
-      <w:r>
-        <w:rPr>
-          <w:rFonts w:ascii="Arial Unicode MS" w:eastAsia="Arial Unicode MS" w:hAnsi="Arial Unicode MS" w:cs="Arial Unicode MS"/>
-        </w:rPr>
-        <w:t xml:space="preserve"> </w:t>
+        <w:t>บิลขายสำหรับบริษัทที่จดทะเบียน</w:t>
+      </w:r>
+      <w:proofErr w:type="spellEnd"/>
+      <w:r>
+        <w:rPr>
+          <w:rFonts w:ascii="Arial Unicode MS" w:eastAsia="Arial Unicode MS" w:hAnsi="Arial Unicode MS" w:cs="Arial Unicode MS"/>
+        </w:rPr>
+        <w:t xml:space="preserve"> VAT (</w:t>
+      </w:r>
+      <w:proofErr w:type="spellStart"/>
+      <w:r>
+        <w:rPr>
+          <w:rFonts w:ascii="Arial Unicode MS" w:eastAsia="Arial Unicode MS" w:hAnsi="Arial Unicode MS" w:cs="Arial Unicode MS"/>
+        </w:rPr>
+        <w:t>คำนวณภาษีแบบ</w:t>
+      </w:r>
+      <w:proofErr w:type="spellEnd"/>
+      <w:r>
+        <w:rPr>
+          <w:rFonts w:ascii="Arial Unicode MS" w:eastAsia="Arial Unicode MS" w:hAnsi="Arial Unicode MS" w:cs="Arial Unicode MS"/>
+        </w:rPr>
+        <w:t xml:space="preserve"> Exclusive/Inclusive) </w:t>
       </w:r>
       <w:proofErr w:type="spellStart"/>
       <w:r>
@@ -634,16 +751,16 @@
           <w:b/>
           <w:bCs/>
         </w:rPr>
-        <w:t xml:space="preserve">ABB (Abbreviated Tax Invoice - </w:t>
-      </w:r>
-      <w:proofErr w:type="spellStart"/>
-      <w:r>
-        <w:rPr>
-          <w:rFonts w:ascii="Arial Unicode MS" w:eastAsia="Arial Unicode MS" w:hAnsi="Arial Unicode MS" w:cs="Arial Unicode MS"/>
-          <w:b/>
-          <w:bCs/>
-        </w:rPr>
-        <w:t>ใบเสร็จรับเงินอย่างย่อ</w:t>
+        <w:t xml:space="preserve">CS_TAX (Cash Sale Tax - </w:t>
+      </w:r>
+      <w:proofErr w:type="spellStart"/>
+      <w:r>
+        <w:rPr>
+          <w:rFonts w:ascii="Arial Unicode MS" w:eastAsia="Arial Unicode MS" w:hAnsi="Arial Unicode MS" w:cs="Arial Unicode MS"/>
+          <w:b/>
+          <w:bCs/>
+        </w:rPr>
+        <w:t>ใบกำกับภาษีอย่างย่อ</w:t>
       </w:r>
       <w:proofErr w:type="spellEnd"/>
       <w:r>
@@ -665,7 +782,35 @@
         <w:rPr>
           <w:rFonts w:ascii="Arial Unicode MS" w:eastAsia="Arial Unicode MS" w:hAnsi="Arial Unicode MS" w:cs="Arial Unicode MS"/>
         </w:rPr>
-        <w:t>ใบเสร็จรับเงินสำหรับขายหน้าร้าน</w:t>
+        <w:t>บิลขายหน้าร้าน</w:t>
+      </w:r>
+      <w:proofErr w:type="spellEnd"/>
+      <w:r>
+        <w:rPr>
+          <w:rFonts w:ascii="Arial Unicode MS" w:eastAsia="Arial Unicode MS" w:hAnsi="Arial Unicode MS" w:cs="Arial Unicode MS"/>
+        </w:rPr>
+        <w:t xml:space="preserve"> (ABB) </w:t>
+      </w:r>
+      <w:proofErr w:type="spellStart"/>
+      <w:r>
+        <w:rPr>
+          <w:rFonts w:ascii="Arial Unicode MS" w:eastAsia="Arial Unicode MS" w:hAnsi="Arial Unicode MS" w:cs="Arial Unicode MS"/>
+        </w:rPr>
+        <w:t>สำหรับลูกค้าทั่วไป</w:t>
+      </w:r>
+      <w:proofErr w:type="spellEnd"/>
+      <w:r>
+        <w:rPr>
+          <w:rFonts w:ascii="Arial Unicode MS" w:eastAsia="Arial Unicode MS" w:hAnsi="Arial Unicode MS" w:cs="Arial Unicode MS"/>
+        </w:rPr>
+        <w:t xml:space="preserve"> </w:t>
+      </w:r>
+      <w:proofErr w:type="spellStart"/>
+      <w:r>
+        <w:rPr>
+          <w:rFonts w:ascii="Arial Unicode MS" w:eastAsia="Arial Unicode MS" w:hAnsi="Arial Unicode MS" w:cs="Arial Unicode MS"/>
+        </w:rPr>
+        <w:t>มีผลตัดสต็อกขาออก</w:t>
       </w:r>
       <w:proofErr w:type="spellEnd"/>
     </w:p>
@@ -689,16 +834,16 @@
           <w:b/>
           <w:bCs/>
         </w:rPr>
-        <w:t xml:space="preserve">BN (Billing Note - </w:t>
-      </w:r>
-      <w:proofErr w:type="spellStart"/>
-      <w:r>
-        <w:rPr>
-          <w:rFonts w:ascii="Arial Unicode MS" w:eastAsia="Arial Unicode MS" w:hAnsi="Arial Unicode MS" w:cs="Arial Unicode MS"/>
-          <w:b/>
-          <w:bCs/>
-        </w:rPr>
-        <w:t>ใบวางบิลลูกหนี้</w:t>
+        <w:t xml:space="preserve">ABB (Abbreviated Tax Invoice - </w:t>
+      </w:r>
+      <w:proofErr w:type="spellStart"/>
+      <w:r>
+        <w:rPr>
+          <w:rFonts w:ascii="Arial Unicode MS" w:eastAsia="Arial Unicode MS" w:hAnsi="Arial Unicode MS" w:cs="Arial Unicode MS"/>
+          <w:b/>
+          <w:bCs/>
+        </w:rPr>
+        <w:t>ใบเสร็จรับเงินอย่างย่อ</w:t>
       </w:r>
       <w:proofErr w:type="spellEnd"/>
       <w:r>
@@ -720,57 +865,9 @@
         <w:rPr>
           <w:rFonts w:ascii="Arial Unicode MS" w:eastAsia="Arial Unicode MS" w:hAnsi="Arial Unicode MS" w:cs="Arial Unicode MS"/>
         </w:rPr>
-        <w:t>เอกสารรวบรวมบิลขายหลายใบเพื่อเรียกเก็บเงิน</w:t>
-      </w:r>
-      <w:proofErr w:type="spellEnd"/>
-      <w:r>
-        <w:rPr>
-          <w:rFonts w:ascii="Arial Unicode MS" w:eastAsia="Arial Unicode MS" w:hAnsi="Arial Unicode MS" w:cs="Arial Unicode MS"/>
-        </w:rPr>
-        <w:t xml:space="preserve"> </w:t>
-      </w:r>
-      <w:proofErr w:type="spellStart"/>
-      <w:r>
-        <w:rPr>
-          <w:rFonts w:ascii="Arial Unicode MS" w:eastAsia="Arial Unicode MS" w:hAnsi="Arial Unicode MS" w:cs="Arial Unicode MS"/>
-        </w:rPr>
-        <w:t>ไม่มีผลต่อ</w:t>
-      </w:r>
-      <w:proofErr w:type="spellEnd"/>
-      <w:r>
-        <w:rPr>
-          <w:rFonts w:ascii="Arial Unicode MS" w:eastAsia="Arial Unicode MS" w:hAnsi="Arial Unicode MS" w:cs="Arial Unicode MS"/>
-        </w:rPr>
-        <w:t xml:space="preserve"> GL (</w:t>
-      </w:r>
-      <w:proofErr w:type="spellStart"/>
-      <w:r>
-        <w:rPr>
-          <w:rFonts w:ascii="Arial Unicode MS" w:eastAsia="Arial Unicode MS" w:hAnsi="Arial Unicode MS" w:cs="Arial Unicode MS"/>
-        </w:rPr>
-        <w:t>ใช้สำหรับการทำ</w:t>
-      </w:r>
-      <w:proofErr w:type="spellEnd"/>
-      <w:r>
-        <w:rPr>
-          <w:rFonts w:ascii="Arial Unicode MS" w:eastAsia="Arial Unicode MS" w:hAnsi="Arial Unicode MS" w:cs="Arial Unicode MS"/>
-        </w:rPr>
-        <w:t xml:space="preserve"> Knock-off Allocation </w:t>
-      </w:r>
-      <w:proofErr w:type="spellStart"/>
-      <w:r>
-        <w:rPr>
-          <w:rFonts w:ascii="Arial Unicode MS" w:eastAsia="Arial Unicode MS" w:hAnsi="Arial Unicode MS" w:cs="Arial Unicode MS"/>
-        </w:rPr>
-        <w:t>ได้ง่ายขึ้น</w:t>
-      </w:r>
-      <w:proofErr w:type="spellEnd"/>
-      <w:r>
-        <w:rPr>
-          <w:rFonts w:ascii="Arial Unicode MS" w:eastAsia="Arial Unicode MS" w:hAnsi="Arial Unicode MS" w:cs="Arial Unicode MS"/>
-        </w:rPr>
-        <w:t>)</w:t>
-      </w:r>
+        <w:t>ใบเสร็จรับเงินสำหรับขายหน้าร้าน</w:t>
+      </w:r>
+      <w:proofErr w:type="spellEnd"/>
     </w:p>
     <w:p>
       <w:pPr>
@@ -792,16 +889,16 @@
           <w:b/>
           <w:bCs/>
         </w:rPr>
-        <w:t xml:space="preserve">REC (Receipt - </w:t>
-      </w:r>
-      <w:proofErr w:type="spellStart"/>
-      <w:r>
-        <w:rPr>
-          <w:rFonts w:ascii="Arial Unicode MS" w:eastAsia="Arial Unicode MS" w:hAnsi="Arial Unicode MS" w:cs="Arial Unicode MS"/>
-          <w:b/>
-          <w:bCs/>
-        </w:rPr>
-        <w:t>ใบเสร็จรับเงิน</w:t>
+        <w:t xml:space="preserve">BN (Billing Note - </w:t>
+      </w:r>
+      <w:proofErr w:type="spellStart"/>
+      <w:r>
+        <w:rPr>
+          <w:rFonts w:ascii="Arial Unicode MS" w:eastAsia="Arial Unicode MS" w:hAnsi="Arial Unicode MS" w:cs="Arial Unicode MS"/>
+          <w:b/>
+          <w:bCs/>
+        </w:rPr>
+        <w:t>ใบวางบิลลูกหนี้</w:t>
       </w:r>
       <w:proofErr w:type="spellEnd"/>
       <w:r>
@@ -823,42 +920,56 @@
         <w:rPr>
           <w:rFonts w:ascii="Arial Unicode MS" w:eastAsia="Arial Unicode MS" w:hAnsi="Arial Unicode MS" w:cs="Arial Unicode MS"/>
         </w:rPr>
-        <w:t>บันทึกรับชำระหนี้จากลูกหนี้</w:t>
-      </w:r>
-      <w:proofErr w:type="spellEnd"/>
-      <w:r>
-        <w:rPr>
-          <w:rFonts w:ascii="Arial Unicode MS" w:eastAsia="Arial Unicode MS" w:hAnsi="Arial Unicode MS" w:cs="Arial Unicode MS"/>
-        </w:rPr>
-        <w:t xml:space="preserve"> </w:t>
-      </w:r>
-      <w:proofErr w:type="spellStart"/>
-      <w:r>
-        <w:rPr>
-          <w:rFonts w:ascii="Arial Unicode MS" w:eastAsia="Arial Unicode MS" w:hAnsi="Arial Unicode MS" w:cs="Arial Unicode MS"/>
-        </w:rPr>
-        <w:t>หรือรับเงินสด</w:t>
-      </w:r>
-      <w:proofErr w:type="spellEnd"/>
-      <w:r>
-        <w:rPr>
-          <w:rFonts w:ascii="Arial Unicode MS" w:eastAsia="Arial Unicode MS" w:hAnsi="Arial Unicode MS" w:cs="Arial Unicode MS"/>
-        </w:rPr>
-        <w:t xml:space="preserve"> (</w:t>
-      </w:r>
-      <w:proofErr w:type="spellStart"/>
-      <w:r>
-        <w:rPr>
-          <w:rFonts w:ascii="Arial Unicode MS" w:eastAsia="Arial Unicode MS" w:hAnsi="Arial Unicode MS" w:cs="Arial Unicode MS"/>
-        </w:rPr>
-        <w:t>ตัดจาก</w:t>
-      </w:r>
-      <w:proofErr w:type="spellEnd"/>
-      <w:r>
-        <w:rPr>
-          <w:rFonts w:ascii="Arial Unicode MS" w:eastAsia="Arial Unicode MS" w:hAnsi="Arial Unicode MS" w:cs="Arial Unicode MS"/>
-        </w:rPr>
-        <w:t xml:space="preserve"> INV_DO, TAX_INV)</w:t>
+        <w:t>เอกสารรวบรวมบิลขายหลายใบเพื่อเรียกเก็บเงิน</w:t>
+      </w:r>
+      <w:proofErr w:type="spellEnd"/>
+      <w:r>
+        <w:rPr>
+          <w:rFonts w:ascii="Arial Unicode MS" w:eastAsia="Arial Unicode MS" w:hAnsi="Arial Unicode MS" w:cs="Arial Unicode MS"/>
+        </w:rPr>
+        <w:t xml:space="preserve"> </w:t>
+      </w:r>
+      <w:proofErr w:type="spellStart"/>
+      <w:r>
+        <w:rPr>
+          <w:rFonts w:ascii="Arial Unicode MS" w:eastAsia="Arial Unicode MS" w:hAnsi="Arial Unicode MS" w:cs="Arial Unicode MS"/>
+        </w:rPr>
+        <w:t>ไม่มีผลต่อ</w:t>
+      </w:r>
+      <w:proofErr w:type="spellEnd"/>
+      <w:r>
+        <w:rPr>
+          <w:rFonts w:ascii="Arial Unicode MS" w:eastAsia="Arial Unicode MS" w:hAnsi="Arial Unicode MS" w:cs="Arial Unicode MS"/>
+        </w:rPr>
+        <w:t xml:space="preserve"> GL (</w:t>
+      </w:r>
+      <w:proofErr w:type="spellStart"/>
+      <w:r>
+        <w:rPr>
+          <w:rFonts w:ascii="Arial Unicode MS" w:eastAsia="Arial Unicode MS" w:hAnsi="Arial Unicode MS" w:cs="Arial Unicode MS"/>
+        </w:rPr>
+        <w:t>ใช้สำหรับการทำ</w:t>
+      </w:r>
+      <w:proofErr w:type="spellEnd"/>
+      <w:r>
+        <w:rPr>
+          <w:rFonts w:ascii="Arial Unicode MS" w:eastAsia="Arial Unicode MS" w:hAnsi="Arial Unicode MS" w:cs="Arial Unicode MS"/>
+        </w:rPr>
+        <w:t xml:space="preserve"> Knock-off Allocation </w:t>
+      </w:r>
+      <w:proofErr w:type="spellStart"/>
+      <w:r>
+        <w:rPr>
+          <w:rFonts w:ascii="Arial Unicode MS" w:eastAsia="Arial Unicode MS" w:hAnsi="Arial Unicode MS" w:cs="Arial Unicode MS"/>
+        </w:rPr>
+        <w:t>ได้ง่ายขึ้น</w:t>
+      </w:r>
+      <w:proofErr w:type="spellEnd"/>
+      <w:r>
+        <w:rPr>
+          <w:rFonts w:ascii="Arial Unicode MS" w:eastAsia="Arial Unicode MS" w:hAnsi="Arial Unicode MS" w:cs="Arial Unicode MS"/>
+        </w:rPr>
+        <w:t>)</w:t>
       </w:r>
     </w:p>
     <w:p>
@@ -881,16 +992,16 @@
           <w:b/>
           <w:bCs/>
         </w:rPr>
-        <w:t xml:space="preserve">DEP_IN (Deposit In - </w:t>
-      </w:r>
-      <w:proofErr w:type="spellStart"/>
-      <w:r>
-        <w:rPr>
-          <w:rFonts w:ascii="Arial Unicode MS" w:eastAsia="Arial Unicode MS" w:hAnsi="Arial Unicode MS" w:cs="Arial Unicode MS"/>
-          <w:b/>
-          <w:bCs/>
-        </w:rPr>
-        <w:t>ใบรับเงินมัดจำ</w:t>
+        <w:t xml:space="preserve">REC (Receipt - </w:t>
+      </w:r>
+      <w:proofErr w:type="spellStart"/>
+      <w:r>
+        <w:rPr>
+          <w:rFonts w:ascii="Arial Unicode MS" w:eastAsia="Arial Unicode MS" w:hAnsi="Arial Unicode MS" w:cs="Arial Unicode MS"/>
+          <w:b/>
+          <w:bCs/>
+        </w:rPr>
+        <w:t>ใบเสร็จรับเงิน</w:t>
       </w:r>
       <w:proofErr w:type="spellEnd"/>
       <w:r>
@@ -912,35 +1023,21 @@
         <w:rPr>
           <w:rFonts w:ascii="Arial Unicode MS" w:eastAsia="Arial Unicode MS" w:hAnsi="Arial Unicode MS" w:cs="Arial Unicode MS"/>
         </w:rPr>
-        <w:t>บันทึกรับเงินมัดจำจากลูกค้า</w:t>
-      </w:r>
-      <w:proofErr w:type="spellEnd"/>
-      <w:r>
-        <w:rPr>
-          <w:rFonts w:ascii="Arial Unicode MS" w:eastAsia="Arial Unicode MS" w:hAnsi="Arial Unicode MS" w:cs="Arial Unicode MS"/>
-        </w:rPr>
-        <w:t xml:space="preserve"> </w:t>
-      </w:r>
-      <w:proofErr w:type="spellStart"/>
-      <w:r>
-        <w:rPr>
-          <w:rFonts w:ascii="Arial Unicode MS" w:eastAsia="Arial Unicode MS" w:hAnsi="Arial Unicode MS" w:cs="Arial Unicode MS"/>
-        </w:rPr>
-        <w:t>สามารถนำยอดไปหักเป็นส่วนลดในใบ</w:t>
-      </w:r>
-      <w:proofErr w:type="spellEnd"/>
-      <w:r>
-        <w:rPr>
-          <w:rFonts w:ascii="Arial Unicode MS" w:eastAsia="Arial Unicode MS" w:hAnsi="Arial Unicode MS" w:cs="Arial Unicode MS"/>
-        </w:rPr>
-        <w:t xml:space="preserve"> REC </w:t>
-      </w:r>
-      <w:proofErr w:type="spellStart"/>
-      <w:r>
-        <w:rPr>
-          <w:rFonts w:ascii="Arial Unicode MS" w:eastAsia="Arial Unicode MS" w:hAnsi="Arial Unicode MS" w:cs="Arial Unicode MS"/>
-        </w:rPr>
-        <w:t>ได้</w:t>
+        <w:t>บันทึกรับชำระหนี้จากลูกหนี้</w:t>
+      </w:r>
+      <w:proofErr w:type="spellEnd"/>
+      <w:r>
+        <w:rPr>
+          <w:rFonts w:ascii="Arial Unicode MS" w:eastAsia="Arial Unicode MS" w:hAnsi="Arial Unicode MS" w:cs="Arial Unicode MS"/>
+        </w:rPr>
+        <w:t xml:space="preserve"> </w:t>
+      </w:r>
+      <w:proofErr w:type="spellStart"/>
+      <w:r>
+        <w:rPr>
+          <w:rFonts w:ascii="Arial Unicode MS" w:eastAsia="Arial Unicode MS" w:hAnsi="Arial Unicode MS" w:cs="Arial Unicode MS"/>
+        </w:rPr>
+        <w:t>หรือรับเงินสด</w:t>
       </w:r>
       <w:proofErr w:type="spellEnd"/>
       <w:r>
@@ -954,14 +1051,14 @@
         <w:rPr>
           <w:rFonts w:ascii="Arial Unicode MS" w:eastAsia="Arial Unicode MS" w:hAnsi="Arial Unicode MS" w:cs="Arial Unicode MS"/>
         </w:rPr>
-        <w:t>ตัดมัดจำ</w:t>
-      </w:r>
-      <w:proofErr w:type="spellEnd"/>
-      <w:r>
-        <w:rPr>
-          <w:rFonts w:ascii="Arial Unicode MS" w:eastAsia="Arial Unicode MS" w:hAnsi="Arial Unicode MS" w:cs="Arial Unicode MS"/>
-        </w:rPr>
-        <w:t>)</w:t>
+        <w:t>ตัดจาก</w:t>
+      </w:r>
+      <w:proofErr w:type="spellEnd"/>
+      <w:r>
+        <w:rPr>
+          <w:rFonts w:ascii="Arial Unicode MS" w:eastAsia="Arial Unicode MS" w:hAnsi="Arial Unicode MS" w:cs="Arial Unicode MS"/>
+        </w:rPr>
+        <w:t xml:space="preserve"> INV_DO, TAX_INV)</w:t>
       </w:r>
     </w:p>
     <w:p>
@@ -984,16 +1081,16 @@
           <w:b/>
           <w:bCs/>
         </w:rPr>
-        <w:t xml:space="preserve">AR_REFUND (SRF - Sales Refund - </w:t>
-      </w:r>
-      <w:proofErr w:type="spellStart"/>
-      <w:r>
-        <w:rPr>
-          <w:rFonts w:ascii="Arial Unicode MS" w:eastAsia="Arial Unicode MS" w:hAnsi="Arial Unicode MS" w:cs="Arial Unicode MS"/>
-          <w:b/>
-          <w:bCs/>
-        </w:rPr>
-        <w:t>ใบสำคัญจ่ายเงินคืน</w:t>
+        <w:t xml:space="preserve">DEP_IN (Deposit In - </w:t>
+      </w:r>
+      <w:proofErr w:type="spellStart"/>
+      <w:r>
+        <w:rPr>
+          <w:rFonts w:ascii="Arial Unicode MS" w:eastAsia="Arial Unicode MS" w:hAnsi="Arial Unicode MS" w:cs="Arial Unicode MS"/>
+          <w:b/>
+          <w:bCs/>
+        </w:rPr>
+        <w:t>ใบรับเงินมัดจำ</w:t>
       </w:r>
       <w:proofErr w:type="spellEnd"/>
       <w:r>
@@ -1015,7 +1112,35 @@
         <w:rPr>
           <w:rFonts w:ascii="Arial Unicode MS" w:eastAsia="Arial Unicode MS" w:hAnsi="Arial Unicode MS" w:cs="Arial Unicode MS"/>
         </w:rPr>
-        <w:t>บันทึกการจ่ายเงินคืนให้ลูกค้า</w:t>
+        <w:t>บันทึกรับเงินมัดจำจากลูกค้า</w:t>
+      </w:r>
+      <w:proofErr w:type="spellEnd"/>
+      <w:r>
+        <w:rPr>
+          <w:rFonts w:ascii="Arial Unicode MS" w:eastAsia="Arial Unicode MS" w:hAnsi="Arial Unicode MS" w:cs="Arial Unicode MS"/>
+        </w:rPr>
+        <w:t xml:space="preserve"> </w:t>
+      </w:r>
+      <w:proofErr w:type="spellStart"/>
+      <w:r>
+        <w:rPr>
+          <w:rFonts w:ascii="Arial Unicode MS" w:eastAsia="Arial Unicode MS" w:hAnsi="Arial Unicode MS" w:cs="Arial Unicode MS"/>
+        </w:rPr>
+        <w:t>สามารถนำยอดไปหักเป็นส่วนลดในใบ</w:t>
+      </w:r>
+      <w:proofErr w:type="spellEnd"/>
+      <w:r>
+        <w:rPr>
+          <w:rFonts w:ascii="Arial Unicode MS" w:eastAsia="Arial Unicode MS" w:hAnsi="Arial Unicode MS" w:cs="Arial Unicode MS"/>
+        </w:rPr>
+        <w:t xml:space="preserve"> REC </w:t>
+      </w:r>
+      <w:proofErr w:type="spellStart"/>
+      <w:r>
+        <w:rPr>
+          <w:rFonts w:ascii="Arial Unicode MS" w:eastAsia="Arial Unicode MS" w:hAnsi="Arial Unicode MS" w:cs="Arial Unicode MS"/>
+        </w:rPr>
+        <w:t>ได้</w:t>
       </w:r>
       <w:proofErr w:type="spellEnd"/>
       <w:r>
@@ -1029,21 +1154,7 @@
         <w:rPr>
           <w:rFonts w:ascii="Arial Unicode MS" w:eastAsia="Arial Unicode MS" w:hAnsi="Arial Unicode MS" w:cs="Arial Unicode MS"/>
         </w:rPr>
-        <w:t>เช่น</w:t>
-      </w:r>
-      <w:proofErr w:type="spellEnd"/>
-      <w:r>
-        <w:rPr>
-          <w:rFonts w:ascii="Arial Unicode MS" w:eastAsia="Arial Unicode MS" w:hAnsi="Arial Unicode MS" w:cs="Arial Unicode MS"/>
-        </w:rPr>
-        <w:t xml:space="preserve"> </w:t>
-      </w:r>
-      <w:proofErr w:type="spellStart"/>
-      <w:r>
-        <w:rPr>
-          <w:rFonts w:ascii="Arial Unicode MS" w:eastAsia="Arial Unicode MS" w:hAnsi="Arial Unicode MS" w:cs="Arial Unicode MS"/>
-        </w:rPr>
-        <w:t>คืนมัดจำ</w:t>
+        <w:t>ตัดมัดจำ</w:t>
       </w:r>
       <w:proofErr w:type="spellEnd"/>
       <w:r>
@@ -1073,16 +1184,16 @@
           <w:b/>
           <w:bCs/>
         </w:rPr>
-        <w:t xml:space="preserve">AR_WRITEOFF (SWO - Sales Write-off - </w:t>
-      </w:r>
-      <w:proofErr w:type="spellStart"/>
-      <w:r>
-        <w:rPr>
-          <w:rFonts w:ascii="Arial Unicode MS" w:eastAsia="Arial Unicode MS" w:hAnsi="Arial Unicode MS" w:cs="Arial Unicode MS"/>
-          <w:b/>
-          <w:bCs/>
-        </w:rPr>
-        <w:t>ใบสำคัญตัดหนี้สูญ</w:t>
+        <w:t xml:space="preserve">AR_REFUND (SRF - Sales Refund - </w:t>
+      </w:r>
+      <w:proofErr w:type="spellStart"/>
+      <w:r>
+        <w:rPr>
+          <w:rFonts w:ascii="Arial Unicode MS" w:eastAsia="Arial Unicode MS" w:hAnsi="Arial Unicode MS" w:cs="Arial Unicode MS"/>
+          <w:b/>
+          <w:bCs/>
+        </w:rPr>
+        <w:t>ใบสำคัญจ่ายเงินคืน</w:t>
       </w:r>
       <w:proofErr w:type="spellEnd"/>
       <w:r>
@@ -1104,23 +1215,43 @@
         <w:rPr>
           <w:rFonts w:ascii="Arial Unicode MS" w:eastAsia="Arial Unicode MS" w:hAnsi="Arial Unicode MS" w:cs="Arial Unicode MS"/>
         </w:rPr>
-        <w:t>บันทึกการตัดยอดหนี้ที่เก็บไม่ได้</w:t>
-      </w:r>
-      <w:proofErr w:type="spellEnd"/>
-      <w:r>
-        <w:rPr>
-          <w:rFonts w:ascii="Arial Unicode MS" w:eastAsia="Arial Unicode MS" w:hAnsi="Arial Unicode MS" w:cs="Arial Unicode MS"/>
-        </w:rPr>
-        <w:t xml:space="preserve"> </w:t>
-      </w:r>
-      <w:proofErr w:type="spellStart"/>
-      <w:r>
-        <w:rPr>
-          <w:rFonts w:ascii="Arial Unicode MS" w:eastAsia="Arial Unicode MS" w:hAnsi="Arial Unicode MS" w:cs="Arial Unicode MS"/>
-        </w:rPr>
-        <w:t>หรือตัดเศษบัญชีลูกหนี้</w:t>
-      </w:r>
-      <w:proofErr w:type="spellEnd"/>
+        <w:t>บันทึกการจ่ายเงินคืนให้ลูกค้า</w:t>
+      </w:r>
+      <w:proofErr w:type="spellEnd"/>
+      <w:r>
+        <w:rPr>
+          <w:rFonts w:ascii="Arial Unicode MS" w:eastAsia="Arial Unicode MS" w:hAnsi="Arial Unicode MS" w:cs="Arial Unicode MS"/>
+        </w:rPr>
+        <w:t xml:space="preserve"> (</w:t>
+      </w:r>
+      <w:proofErr w:type="spellStart"/>
+      <w:r>
+        <w:rPr>
+          <w:rFonts w:ascii="Arial Unicode MS" w:eastAsia="Arial Unicode MS" w:hAnsi="Arial Unicode MS" w:cs="Arial Unicode MS"/>
+        </w:rPr>
+        <w:t>เช่น</w:t>
+      </w:r>
+      <w:proofErr w:type="spellEnd"/>
+      <w:r>
+        <w:rPr>
+          <w:rFonts w:ascii="Arial Unicode MS" w:eastAsia="Arial Unicode MS" w:hAnsi="Arial Unicode MS" w:cs="Arial Unicode MS"/>
+        </w:rPr>
+        <w:t xml:space="preserve"> </w:t>
+      </w:r>
+      <w:proofErr w:type="spellStart"/>
+      <w:r>
+        <w:rPr>
+          <w:rFonts w:ascii="Arial Unicode MS" w:eastAsia="Arial Unicode MS" w:hAnsi="Arial Unicode MS" w:cs="Arial Unicode MS"/>
+        </w:rPr>
+        <w:t>คืนมัดจำ</w:t>
+      </w:r>
+      <w:proofErr w:type="spellEnd"/>
+      <w:r>
+        <w:rPr>
+          <w:rFonts w:ascii="Arial Unicode MS" w:eastAsia="Arial Unicode MS" w:hAnsi="Arial Unicode MS" w:cs="Arial Unicode MS"/>
+        </w:rPr>
+        <w:t>)</w:t>
+      </w:r>
     </w:p>
     <w:p>
       <w:pPr>
@@ -1142,6 +1273,76 @@
           <w:b/>
           <w:bCs/>
         </w:rPr>
+        <w:lastRenderedPageBreak/>
+        <w:t xml:space="preserve">AR_WRITEOFF (SWO - Sales Write-off - </w:t>
+      </w:r>
+      <w:proofErr w:type="spellStart"/>
+      <w:r>
+        <w:rPr>
+          <w:rFonts w:ascii="Arial Unicode MS" w:eastAsia="Arial Unicode MS" w:hAnsi="Arial Unicode MS" w:cs="Arial Unicode MS"/>
+          <w:b/>
+          <w:bCs/>
+        </w:rPr>
+        <w:t>ใบสำคัญตัดหนี้สูญ</w:t>
+      </w:r>
+      <w:proofErr w:type="spellEnd"/>
+      <w:r>
+        <w:rPr>
+          <w:rFonts w:ascii="Arial Unicode MS" w:eastAsia="Arial Unicode MS" w:hAnsi="Arial Unicode MS" w:cs="Arial Unicode MS"/>
+          <w:b/>
+          <w:bCs/>
+        </w:rPr>
+        <w:t>):</w:t>
+      </w:r>
+      <w:r>
+        <w:rPr>
+          <w:rFonts w:ascii="Arial Unicode MS" w:eastAsia="Arial Unicode MS" w:hAnsi="Arial Unicode MS" w:cs="Arial Unicode MS"/>
+        </w:rPr>
+        <w:t xml:space="preserve"> </w:t>
+      </w:r>
+      <w:proofErr w:type="spellStart"/>
+      <w:r>
+        <w:rPr>
+          <w:rFonts w:ascii="Arial Unicode MS" w:eastAsia="Arial Unicode MS" w:hAnsi="Arial Unicode MS" w:cs="Arial Unicode MS"/>
+        </w:rPr>
+        <w:t>บันทึกการตัดยอดหนี้ที่เก็บไม่ได้</w:t>
+      </w:r>
+      <w:proofErr w:type="spellEnd"/>
+      <w:r>
+        <w:rPr>
+          <w:rFonts w:ascii="Arial Unicode MS" w:eastAsia="Arial Unicode MS" w:hAnsi="Arial Unicode MS" w:cs="Arial Unicode MS"/>
+        </w:rPr>
+        <w:t xml:space="preserve"> </w:t>
+      </w:r>
+      <w:proofErr w:type="spellStart"/>
+      <w:r>
+        <w:rPr>
+          <w:rFonts w:ascii="Arial Unicode MS" w:eastAsia="Arial Unicode MS" w:hAnsi="Arial Unicode MS" w:cs="Arial Unicode MS"/>
+        </w:rPr>
+        <w:t>หรือตัดเศษบัญชีลูกหนี้</w:t>
+      </w:r>
+      <w:proofErr w:type="spellEnd"/>
+    </w:p>
+    <w:p>
+      <w:pPr>
+        <w:numPr>
+          <w:ilvl w:val="0"/>
+          <w:numId w:val="1"/>
+        </w:numPr>
+        <w:pBdr>
+          <w:top w:val="nil"/>
+          <w:left w:val="nil"/>
+          <w:bottom w:val="nil"/>
+          <w:right w:val="nil"/>
+          <w:between w:val="nil"/>
+        </w:pBdr>
+      </w:pPr>
+      <w:r>
+        <w:rPr>
+          <w:rFonts w:ascii="Arial Unicode MS" w:eastAsia="Arial Unicode MS" w:hAnsi="Arial Unicode MS" w:cs="Arial Unicode MS"/>
+          <w:b/>
+          <w:bCs/>
+        </w:rPr>
         <w:t xml:space="preserve">CN (Credit Note - </w:t>
       </w:r>
       <w:proofErr w:type="spellStart"/>
@@ -1208,14 +1409,7 @@
         <w:rPr>
           <w:rFonts w:ascii="Arial Unicode MS" w:eastAsia="Arial Unicode MS" w:hAnsi="Arial Unicode MS" w:cs="Arial Unicode MS"/>
         </w:rPr>
-        <w:t xml:space="preserve"> </w:t>
-      </w:r>
-      <w:r>
-        <w:rPr>
-          <w:rFonts w:ascii="Arial Unicode MS" w:eastAsia="Arial Unicode MS" w:hAnsi="Arial Unicode MS" w:cs="Arial Unicode MS"/>
-        </w:rPr>
-        <w:lastRenderedPageBreak/>
-        <w:t>(</w:t>
+        <w:t xml:space="preserve"> (</w:t>
       </w:r>
       <w:proofErr w:type="spellStart"/>
       <w:r>
@@ -2412,6 +2606,7 @@
           <w:b/>
           <w:bCs/>
         </w:rPr>
+        <w:lastRenderedPageBreak/>
         <w:t xml:space="preserve">TB (Technician Billing - </w:t>
       </w:r>
       <w:proofErr w:type="spellStart"/>
@@ -2476,7 +2671,6 @@
         <w:rPr>
           <w:rFonts w:ascii="Arial Unicode MS" w:eastAsia="Arial Unicode MS" w:hAnsi="Arial Unicode MS" w:cs="Arial Unicode MS"/>
         </w:rPr>
-        <w:lastRenderedPageBreak/>
         <w:t>กลุ่มงานค่าใช้จ่ายและสินทรัพย์</w:t>
       </w:r>
       <w:proofErr w:type="spellEnd"/>
@@ -3864,6 +4058,7 @@
         <w:rPr>
           <w:rFonts w:ascii="Arial Unicode MS" w:eastAsia="Arial Unicode MS" w:hAnsi="Arial Unicode MS" w:cs="Arial Unicode MS"/>
         </w:rPr>
+        <w:lastRenderedPageBreak/>
         <w:t>ระบบจะโคลนข้อมูลไปสร้างเป็น</w:t>
       </w:r>
       <w:proofErr w:type="spellEnd"/>
@@ -3976,7 +4171,6 @@
         <w:rPr>
           <w:rFonts w:ascii="Arial Unicode MS" w:eastAsia="Arial Unicode MS" w:hAnsi="Arial Unicode MS" w:cs="Arial Unicode MS"/>
         </w:rPr>
-        <w:lastRenderedPageBreak/>
         <w:t>สถานะพิเศษสำหรับเอกสาร</w:t>
       </w:r>
       <w:proofErr w:type="spellEnd"/>
@@ -5387,11 +5581,9 @@
           <w:right w:val="nil"/>
           <w:between w:val="nil"/>
         </w:pBdr>
-        <w:rPr>
-          <w:rFonts w:hint="cs"/>
-        </w:rPr>
-      </w:pPr>
-      <w:r>
+      </w:pPr>
+      <w:r>
+        <w:lastRenderedPageBreak/>
         <w:t xml:space="preserve">5. </w:t>
       </w:r>
       <w:r>
@@ -8657,6 +8849,7 @@
   <w:style w:type="character" w:default="1" w:styleId="DefaultParagraphFont">
     <w:name w:val="Default Paragraph Font"/>
     <w:uiPriority w:val="1"/>
+    <w:semiHidden/>
     <w:unhideWhenUsed/>
   </w:style>
   <w:style w:type="table" w:default="1" w:styleId="TableNormal">

</xml_diff>